<commit_message>
Updated Week Fifteen Report
</commit_message>
<xml_diff>
--- a/Week Fifteen Report.docx
+++ b/Week Fifteen Report.docx
@@ -454,29 +454,20 @@
     </w:p>
     <w:p>
       <w:pPr>
-        <w:numPr>
-          <w:ilvl w:val="0"/>
-          <w:numId w:val="2"/>
-        </w:numPr>
-        <w:ind w:left="720" w:hanging="360"/>
-        <w:rPr>
-          <w:b w:val="1"/>
-          <w:bCs w:val="1"/>
-          <w:sz w:val="24"/>
-          <w:szCs w:val="24"/>
-          <w:u w:val="none"/>
-        </w:rPr>
-      </w:pPr>
-      <w:r>
-        <w:rPr>
-          <w:b w:val="1"/>
-          <w:bCs w:val="1"/>
+        <w:ind w:left="0" w:firstLine="0"/>
+        <w:rPr>
+          <w:sz w:val="24"/>
+          <w:szCs w:val="24"/>
+        </w:rPr>
+      </w:pPr>
+      <w:r>
+        <w:rPr>
           <w:sz w:val="24"/>
           <w:szCs w:val="24"/>
         </w:rPr>
         <w:drawing>
           <wp:inline distB="114300" distT="114300" distL="114300" distR="114300">
-            <wp:extent cx="4289612" cy="7596188"/>
+            <wp:extent cx="6090300" cy="12144022"/>
             <wp:effectExtent b="0" l="0" r="0" t="0"/>
             <wp:docPr id="2" name="image1.png"/>
             <a:graphic>
@@ -496,7 +487,7 @@
                   <pic:spPr>
                     <a:xfrm>
                       <a:off x="0" y="0"/>
-                      <a:ext cx="4289612" cy="7596188"/>
+                      <a:ext cx="6090300" cy="12144022"/>
                     </a:xfrm>
                     <a:prstGeom prst="rect"/>
                     <a:ln/>
@@ -521,22 +512,17 @@
         </w:numPr>
         <w:ind w:left="720" w:hanging="360"/>
         <w:rPr>
-          <w:b w:val="1"/>
-          <w:bCs w:val="1"/>
-          <w:sz w:val="24"/>
-          <w:szCs w:val="24"/>
-          <w:u w:val="none"/>
-        </w:rPr>
-      </w:pPr>
-      <w:r>
-        <w:rPr>
-          <w:b w:val="1"/>
-          <w:bCs w:val="1"/>
-          <w:sz w:val="24"/>
-          <w:szCs w:val="24"/>
-          <w:rtl w:val="0"/>
-        </w:rPr>
-        <w:t xml:space="preserve">Results of Extreme Scaling:</w:t>
+          <w:sz w:val="24"/>
+          <w:szCs w:val="24"/>
+        </w:rPr>
+      </w:pPr>
+      <w:r>
+        <w:rPr>
+          <w:sz w:val="24"/>
+          <w:szCs w:val="24"/>
+          <w:rtl w:val="0"/>
+        </w:rPr>
+        <w:t xml:space="preserve">The results show that the validation accuracy remains around 80%-81%, meaning that the model got about 80 out of the 100 of the true labels correct. The evaluation loss measured around 0.47-0.5, meaning that the model is not overly confident in its calculations.</w:t>
       </w:r>
     </w:p>
     <w:p>
@@ -560,10 +546,27 @@
           <w:bCs w:val="1"/>
           <w:sz w:val="24"/>
           <w:szCs w:val="24"/>
+          <w:rtl w:val="0"/>
+        </w:rPr>
+        <w:t xml:space="preserve">Results of Extreme Scaling:</w:t>
+      </w:r>
+    </w:p>
+    <w:p>
+      <w:pPr>
+        <w:ind w:left="0" w:firstLine="0"/>
+        <w:rPr>
+          <w:sz w:val="24"/>
+          <w:szCs w:val="24"/>
+        </w:rPr>
+      </w:pPr>
+      <w:r>
+        <w:rPr>
+          <w:sz w:val="24"/>
+          <w:szCs w:val="24"/>
         </w:rPr>
         <w:drawing>
           <wp:inline distB="114300" distT="114300" distL="114300" distR="114300">
-            <wp:extent cx="4272119" cy="8451968"/>
+            <wp:extent cx="6111141" cy="12434925"/>
             <wp:effectExtent b="0" l="0" r="0" t="0"/>
             <wp:docPr id="1" name="image2.png"/>
             <a:graphic>
@@ -583,7 +586,7 @@
                   <pic:spPr>
                     <a:xfrm>
                       <a:off x="0" y="0"/>
-                      <a:ext cx="4272119" cy="8451968"/>
+                      <a:ext cx="6111141" cy="12434925"/>
                     </a:xfrm>
                     <a:prstGeom prst="rect"/>
                     <a:ln/>
@@ -598,6 +601,27 @@
         <w:rPr>
           <w:rtl w:val="0"/>
         </w:rPr>
+      </w:r>
+    </w:p>
+    <w:p>
+      <w:pPr>
+        <w:numPr>
+          <w:ilvl w:val="0"/>
+          <w:numId w:val="2"/>
+        </w:numPr>
+        <w:ind w:left="720" w:hanging="360"/>
+        <w:rPr>
+          <w:sz w:val="24"/>
+          <w:szCs w:val="24"/>
+        </w:rPr>
+      </w:pPr>
+      <w:r>
+        <w:rPr>
+          <w:sz w:val="24"/>
+          <w:szCs w:val="24"/>
+          <w:rtl w:val="0"/>
+        </w:rPr>
+        <w:t xml:space="preserve">The results are similar to the Gaussian Noise with around 82% validation accuracy and 0.49-0.57 evaluation loss. The model performed slightly worse with the final loss being 0.72 and round 9 having only 79.9% accuracy.</w:t>
       </w:r>
     </w:p>
     <w:p>

</xml_diff>